<commit_message>
POO S13 (Archivos): profundizacion rigurosa (streams, try-with-resources, CSV round-trip, repositorio)
</commit_message>
<xml_diff>
--- a/13-week/optional-activity/pdf/Actividad-Semana13.docx
+++ b/13-week/optional-activity/pdf/Actividad-Semana13.docx
@@ -31,7 +31,7 @@
           <w:sz w:val="22"/>
           <w:szCs w:val="22"/>
         </w:rPr>
-        <w:t xml:space="preserve">Programación y Diseño Orientado a Objetos · Semana 13 · Persistencia con archivos</w:t>
+        <w:t xml:space="preserve">Programación y Diseño Orientado a Objetos · Semana 13 · Persistencia de objetos con archivos</w:t>
       </w:r>
     </w:p>
     <w:tbl>
@@ -430,7 +430,7 @@
           <w:sz w:val="22"/>
           <w:szCs w:val="22"/>
         </w:rPr>
-        <w:t xml:space="preserve">Escribir objetos en un archivo de texto (CSV).</w:t>
+        <w:t xml:space="preserve">Escribir objetos en un archivo CSV y leerlos de vuelta.</w:t>
       </w:r>
     </w:p>
     <w:p>
@@ -454,7 +454,7 @@
           <w:sz w:val="22"/>
           <w:szCs w:val="22"/>
         </w:rPr>
-        <w:t xml:space="preserve">Leer el archivo y reconstruir la información.</w:t>
+        <w:t xml:space="preserve">Manejar la IOException con try-with-resources.</w:t>
       </w:r>
     </w:p>
     <w:p>
@@ -478,7 +478,7 @@
           <w:sz w:val="22"/>
           <w:szCs w:val="22"/>
         </w:rPr>
-        <w:t xml:space="preserve">Manejar la IOException con try-with-resources.</w:t>
+        <w:t xml:space="preserve">Separar la persistencia del modelo (responsabilidad única).</w:t>
       </w:r>
     </w:p>
     <w:p>
@@ -563,7 +563,7 @@
           <w:sz w:val="22"/>
           <w:szCs w:val="22"/>
         </w:rPr>
-        <w:t xml:space="preserve">Guarda una lista de contactos en </w:t>
+        <w:t xml:space="preserve">Crea </w:t>
       </w:r>
       <w:r>
         <w:rPr>
@@ -572,16 +572,89 @@
           <w:sz w:val="22"/>
           <w:szCs w:val="22"/>
         </w:rPr>
-        <w:t xml:space="preserve">contactos.csv</w:t>
-      </w:r>
-      <w:r>
-        <w:rPr>
-          <w:rFonts w:ascii="Times New Roman" w:hAnsi="Times New Roman" w:cs="Times New Roman"/>
-          <w:color w:val="000000"/>
-          <w:sz w:val="22"/>
-          <w:szCs w:val="22"/>
-        </w:rPr>
-        <w:t xml:space="preserve"> (una línea por contacto).</w:t>
+        <w:t xml:space="preserve">ContactoRepositorio</w:t>
+      </w:r>
+      <w:r>
+        <w:rPr>
+          <w:rFonts w:ascii="Times New Roman" w:hAnsi="Times New Roman" w:cs="Times New Roman"/>
+          <w:color w:val="000000"/>
+          <w:sz w:val="22"/>
+          <w:szCs w:val="22"/>
+        </w:rPr>
+        <w:t xml:space="preserve"> con </w:t>
+      </w:r>
+      <w:r>
+        <w:rPr>
+          <w:rFonts w:ascii="Consolas" w:hAnsi="Consolas" w:cs="Consolas"/>
+          <w:color w:val="000000"/>
+          <w:sz w:val="22"/>
+          <w:szCs w:val="22"/>
+        </w:rPr>
+        <w:t xml:space="preserve">guardar(List&lt;Contacto&gt;, ruta)</w:t>
+      </w:r>
+      <w:r>
+        <w:rPr>
+          <w:rFonts w:ascii="Times New Roman" w:hAnsi="Times New Roman" w:cs="Times New Roman"/>
+          <w:color w:val="000000"/>
+          <w:sz w:val="22"/>
+          <w:szCs w:val="22"/>
+        </w:rPr>
+        <w:t xml:space="preserve"> y </w:t>
+      </w:r>
+      <w:r>
+        <w:rPr>
+          <w:rFonts w:ascii="Consolas" w:hAnsi="Consolas" w:cs="Consolas"/>
+          <w:color w:val="000000"/>
+          <w:sz w:val="22"/>
+          <w:szCs w:val="22"/>
+        </w:rPr>
+        <w:t xml:space="preserve">cargar(ruta)</w:t>
+      </w:r>
+      <w:r>
+        <w:rPr>
+          <w:rFonts w:ascii="Times New Roman" w:hAnsi="Times New Roman" w:cs="Times New Roman"/>
+          <w:color w:val="000000"/>
+          <w:sz w:val="22"/>
+          <w:szCs w:val="22"/>
+        </w:rPr>
+        <w:t xml:space="preserve"> (CSV), usando </w:t>
+      </w:r>
+      <w:r>
+        <w:rPr>
+          <w:rFonts w:ascii="Times New Roman" w:hAnsi="Times New Roman" w:cs="Times New Roman"/>
+          <w:b/>
+          <w:color w:val="000000"/>
+          <w:sz w:val="22"/>
+          <w:szCs w:val="22"/>
+        </w:rPr>
+        <w:t xml:space="preserve">try-with-resources</w:t>
+      </w:r>
+      <w:r>
+        <w:rPr>
+          <w:rFonts w:ascii="Times New Roman" w:hAnsi="Times New Roman" w:cs="Times New Roman"/>
+          <w:color w:val="000000"/>
+          <w:sz w:val="22"/>
+          <w:szCs w:val="22"/>
+        </w:rPr>
+        <w:t xml:space="preserve"> y manejando </w:t>
+      </w:r>
+      <w:r>
+        <w:rPr>
+          <w:rFonts w:ascii="Consolas" w:hAnsi="Consolas" w:cs="Consolas"/>
+          <w:color w:val="000000"/>
+          <w:sz w:val="22"/>
+          <w:szCs w:val="22"/>
+        </w:rPr>
+        <w:t xml:space="preserve">IOException</w:t>
+      </w:r>
+      <w:r>
+        <w:rPr>
+          <w:rFonts w:ascii="Times New Roman" w:hAnsi="Times New Roman" w:cs="Times New Roman"/>
+          <w:color w:val="000000"/>
+          <w:sz w:val="22"/>
+          <w:szCs w:val="22"/>
+        </w:rPr>
+        <w:t xml:space="preserve">.</w:t>
       </w:r>
     </w:p>
     <w:p>
@@ -605,7 +678,63 @@
           <w:sz w:val="22"/>
           <w:szCs w:val="22"/>
         </w:rPr>
-        <w:t xml:space="preserve">Lee el archivo y muestra los contactos en pantalla.</w:t>
+        <w:t xml:space="preserve">En </w:t>
+      </w:r>
+      <w:r>
+        <w:rPr>
+          <w:rFonts w:ascii="Consolas" w:hAnsi="Consolas" w:cs="Consolas"/>
+          <w:color w:val="000000"/>
+          <w:sz w:val="22"/>
+          <w:szCs w:val="22"/>
+        </w:rPr>
+        <w:t xml:space="preserve">Main</w:t>
+      </w:r>
+      <w:r>
+        <w:rPr>
+          <w:rFonts w:ascii="Times New Roman" w:hAnsi="Times New Roman" w:cs="Times New Roman"/>
+          <w:color w:val="000000"/>
+          <w:sz w:val="22"/>
+          <w:szCs w:val="22"/>
+        </w:rPr>
+        <w:t xml:space="preserve">: crea contactos, </w:t>
+      </w:r>
+      <w:r>
+        <w:rPr>
+          <w:rFonts w:ascii="Times New Roman" w:hAnsi="Times New Roman" w:cs="Times New Roman"/>
+          <w:b/>
+          <w:color w:val="000000"/>
+          <w:sz w:val="22"/>
+          <w:szCs w:val="22"/>
+        </w:rPr>
+        <w:t xml:space="preserve">guárdalos</w:t>
+      </w:r>
+      <w:r>
+        <w:rPr>
+          <w:rFonts w:ascii="Times New Roman" w:hAnsi="Times New Roman" w:cs="Times New Roman"/>
+          <w:color w:val="000000"/>
+          <w:sz w:val="22"/>
+          <w:szCs w:val="22"/>
+        </w:rPr>
+        <w:t xml:space="preserve">, luego </w:t>
+      </w:r>
+      <w:r>
+        <w:rPr>
+          <w:rFonts w:ascii="Times New Roman" w:hAnsi="Times New Roman" w:cs="Times New Roman"/>
+          <w:b/>
+          <w:color w:val="000000"/>
+          <w:sz w:val="22"/>
+          <w:szCs w:val="22"/>
+        </w:rPr>
+        <w:t xml:space="preserve">cárgalos</w:t>
+      </w:r>
+      <w:r>
+        <w:rPr>
+          <w:rFonts w:ascii="Times New Roman" w:hAnsi="Times New Roman" w:cs="Times New Roman"/>
+          <w:color w:val="000000"/>
+          <w:sz w:val="22"/>
+          <w:szCs w:val="22"/>
+        </w:rPr>
+        <w:t xml:space="preserve"> en una nueva lista y muéstralos (demuestra el round-trip).</w:t>
       </w:r>
     </w:p>
     <w:p>
@@ -629,7 +758,50 @@
           <w:sz w:val="22"/>
           <w:szCs w:val="22"/>
         </w:rPr>
-        <w:t xml:space="preserve">Maneja el caso de archivo inexistente con try/catch.</w:t>
+        <w:t xml:space="preserve">Maneja el caso de archivo inexistente al cargar (mensaje claro, lista vacía).</w:t>
+      </w:r>
+    </w:p>
+    <w:p>
+      <w:pPr>
+        <w:spacing w:after="120" w:line="276" w:lineRule="auto"/>
+        <w:ind w:left="454" w:hanging="284"/>
+      </w:pPr>
+      <w:r>
+        <w:rPr>
+          <w:rFonts w:ascii="Times New Roman" w:hAnsi="Times New Roman" w:cs="Times New Roman"/>
+          <w:color w:val="000000"/>
+          <w:sz w:val="22"/>
+          <w:szCs w:val="22"/>
+        </w:rPr>
+        <w:t xml:space="preserve">5.	</w:t>
+      </w:r>
+      <w:r>
+        <w:rPr>
+          <w:rFonts w:ascii="Times New Roman" w:hAnsi="Times New Roman" w:cs="Times New Roman"/>
+          <w:color w:val="000000"/>
+          <w:sz w:val="22"/>
+          <w:szCs w:val="22"/>
+        </w:rPr>
+        <w:t xml:space="preserve">(Reto +) Agrega un contacto nuevo en modo </w:t>
+      </w:r>
+      <w:r>
+        <w:rPr>
+          <w:rFonts w:ascii="Times New Roman" w:hAnsi="Times New Roman" w:cs="Times New Roman"/>
+          <w:b/>
+          <w:color w:val="000000"/>
+          <w:sz w:val="22"/>
+          <w:szCs w:val="22"/>
+        </w:rPr>
+        <w:t xml:space="preserve">append</w:t>
+      </w:r>
+      <w:r>
+        <w:rPr>
+          <w:rFonts w:ascii="Times New Roman" w:hAnsi="Times New Roman" w:cs="Times New Roman"/>
+          <w:color w:val="000000"/>
+          <w:sz w:val="22"/>
+          <w:szCs w:val="22"/>
+        </w:rPr>
+        <w:t xml:space="preserve"> sin reescribir todo el archivo.</w:t>
       </w:r>
     </w:p>
     <w:p>
@@ -672,7 +844,7 @@
           <w:sz w:val="22"/>
           <w:szCs w:val="22"/>
         </w:rPr>
-        <w:t xml:space="preserve">Escritura y lectura de archivo.</w:t>
+        <w:t xml:space="preserve">Escritura y lectura CSV con round-trip verificado.</w:t>
       </w:r>
     </w:p>
     <w:p>
@@ -696,7 +868,7 @@
           <w:sz w:val="22"/>
           <w:szCs w:val="22"/>
         </w:rPr>
-        <w:t xml:space="preserve">Uso de try-with-resources.</w:t>
+        <w:t xml:space="preserve">try-with-resources + manejo de IOException.</w:t>
       </w:r>
     </w:p>
     <w:p>
@@ -720,7 +892,61 @@
           <w:sz w:val="22"/>
           <w:szCs w:val="22"/>
         </w:rPr>
-        <w:t xml:space="preserve">Manejo de IOException.</w:t>
+        <w:t xml:space="preserve">Persistencia separada en </w:t>
+      </w:r>
+      <w:r>
+        <w:rPr>
+          <w:rFonts w:ascii="Consolas" w:hAnsi="Consolas" w:cs="Consolas"/>
+          <w:color w:val="000000"/>
+          <w:sz w:val="22"/>
+          <w:szCs w:val="22"/>
+        </w:rPr>
+        <w:t xml:space="preserve">ContactoRepositorio</w:t>
+      </w:r>
+      <w:r>
+        <w:rPr>
+          <w:rFonts w:ascii="Times New Roman" w:hAnsi="Times New Roman" w:cs="Times New Roman"/>
+          <w:color w:val="000000"/>
+          <w:sz w:val="22"/>
+          <w:szCs w:val="22"/>
+        </w:rPr>
+        <w:t xml:space="preserve"> (no en </w:t>
+      </w:r>
+      <w:r>
+        <w:rPr>
+          <w:rFonts w:ascii="Consolas" w:hAnsi="Consolas" w:cs="Consolas"/>
+          <w:color w:val="000000"/>
+          <w:sz w:val="22"/>
+          <w:szCs w:val="22"/>
+        </w:rPr>
+        <w:t xml:space="preserve">Contacto</w:t>
+      </w:r>
+      <w:r>
+        <w:rPr>
+          <w:rFonts w:ascii="Times New Roman" w:hAnsi="Times New Roman" w:cs="Times New Roman"/>
+          <w:color w:val="000000"/>
+          <w:sz w:val="22"/>
+          <w:szCs w:val="22"/>
+        </w:rPr>
+        <w:t xml:space="preserve"> ni en </w:t>
+      </w:r>
+      <w:r>
+        <w:rPr>
+          <w:rFonts w:ascii="Consolas" w:hAnsi="Consolas" w:cs="Consolas"/>
+          <w:color w:val="000000"/>
+          <w:sz w:val="22"/>
+          <w:szCs w:val="22"/>
+        </w:rPr>
+        <w:t xml:space="preserve">Main</w:t>
+      </w:r>
+      <w:r>
+        <w:rPr>
+          <w:rFonts w:ascii="Times New Roman" w:hAnsi="Times New Roman" w:cs="Times New Roman"/>
+          <w:color w:val="000000"/>
+          <w:sz w:val="22"/>
+          <w:szCs w:val="22"/>
+        </w:rPr>
+        <w:t xml:space="preserve">).</w:t>
       </w:r>
     </w:p>
     <w:p>
@@ -823,7 +1049,7 @@
           <w:sz w:val="18"/>
           <w:szCs w:val="18"/>
         </w:rPr>
-        <w:t xml:space="preserve">  README.md   -&gt; como ejecutar + ejemplo del CSV</w:t>
+        <w:t xml:space="preserve">  README.md   -&gt; como ejecutar + ejemplo del CSV + evidencia del round-trip</w:t>
       </w:r>
     </w:p>
     <w:p>
@@ -839,11 +1065,27 @@
           <w:sz w:val="18"/>
           <w:szCs w:val="18"/>
         </w:rPr>
-        <w:t xml:space="preserve">  src/         -&gt; Contacto.java, Main.java</w:t>
+        <w:t xml:space="preserve">  src/         -&gt; Contacto.java, ContactoRepositorio.java, Main.java</w:t>
       </w:r>
     </w:p>
     <w:p>
       <w:pPr>
+        <w:spacing w:after="0" w:line="276" w:lineRule="auto"/>
+        <w:ind w:left="120"/>
+        <w:shd w:val="clear" w:color="auto" w:fill="F0F4F4"/>
+      </w:pPr>
+      <w:r>
+        <w:rPr>
+          <w:rFonts w:ascii="Consolas" w:hAnsi="Consolas" w:cs="Consolas"/>
+          <w:color w:val="2C3E50"/>
+          <w:sz w:val="18"/>
+          <w:szCs w:val="18"/>
+        </w:rPr>
+        <w:t xml:space="preserve">  data/        -&gt; contactos.csv (ejemplo)</w:t>
+      </w:r>
+    </w:p>
+    <w:p>
+      <w:pPr>
         <w:spacing w:after="120" w:line="276" w:lineRule="auto"/>
         <w:ind w:left="454" w:hanging="284"/>
       </w:pPr>
@@ -863,7 +1105,7 @@
           <w:sz w:val="22"/>
           <w:szCs w:val="22"/>
         </w:rPr>
-        <w:t xml:space="preserve">Crea el repo público con ese nombre.</w:t>
+        <w:t xml:space="preserve">Crea el repositorio público con ese nombre.</w:t>
       </w:r>
     </w:p>
     <w:p>
@@ -887,25 +1129,7 @@
           <w:sz w:val="22"/>
           <w:szCs w:val="22"/>
         </w:rPr>
-        <w:t xml:space="preserve">Sube el código y el README (incluye un </w:t>
-      </w:r>
-      <w:r>
-        <w:rPr>
-          <w:rFonts w:ascii="Consolas" w:hAnsi="Consolas" w:cs="Consolas"/>
-          <w:color w:val="000000"/>
-          <w:sz w:val="22"/>
-          <w:szCs w:val="22"/>
-        </w:rPr>
-        <w:t xml:space="preserve">contactos.csv</w:t>
-      </w:r>
-      <w:r>
-        <w:rPr>
-          <w:rFonts w:ascii="Times New Roman" w:hAnsi="Times New Roman" w:cs="Times New Roman"/>
-          <w:color w:val="000000"/>
-          <w:sz w:val="22"/>
-          <w:szCs w:val="22"/>
-        </w:rPr>
-        <w:t xml:space="preserve"> de ejemplo).</w:t>
+        <w:t xml:space="preserve">Sube el código, el README y un CSV de ejemplo.</w:t>
       </w:r>
     </w:p>
     <w:p>
@@ -929,7 +1153,7 @@
           <w:sz w:val="22"/>
           <w:szCs w:val="22"/>
         </w:rPr>
-        <w:t xml:space="preserve">Comparte el enlace por el canal indicado.</w:t>
+        <w:t xml:space="preserve">Comparte el enlace por el canal indicado por el docente.</w:t>
       </w:r>
     </w:p>
     <w:p>
@@ -1012,7 +1236,7 @@
                 <w:sz w:val="20"/>
                 <w:szCs w:val="20"/>
               </w:rPr>
-              <w:t xml:space="preserve">Excelente</w:t>
+              <w:t xml:space="preserve">Excelente (100%)</w:t>
             </w:r>
           </w:p>
         </w:tc>
@@ -1034,7 +1258,7 @@
                 <w:sz w:val="20"/>
                 <w:szCs w:val="20"/>
               </w:rPr>
-              <w:t xml:space="preserve">Aceptable</w:t>
+              <w:t xml:space="preserve">Aceptable (60%)</w:t>
             </w:r>
           </w:p>
         </w:tc>
@@ -1056,7 +1280,7 @@
                 <w:sz w:val="20"/>
                 <w:szCs w:val="20"/>
               </w:rPr>
-              <w:t xml:space="preserve">Por mejorar</w:t>
+              <w:t xml:space="preserve">Por mejorar (0%)</w:t>
             </w:r>
           </w:p>
         </w:tc>
@@ -1100,7 +1324,7 @@
                 <w:sz w:val="20"/>
                 <w:szCs w:val="20"/>
               </w:rPr>
-              <w:t xml:space="preserve">Escritura en archivo</w:t>
+              <w:t xml:space="preserve">Escritura CSV</w:t>
             </w:r>
           </w:p>
         </w:tc>
@@ -1180,7 +1404,7 @@
                 <w:sz w:val="20"/>
                 <w:szCs w:val="20"/>
               </w:rPr>
-              <w:t xml:space="preserve">30</w:t>
+              <w:t xml:space="preserve">25</w:t>
             </w:r>
           </w:p>
         </w:tc>
@@ -1202,7 +1426,7 @@
                 <w:sz w:val="20"/>
                 <w:szCs w:val="20"/>
               </w:rPr>
-              <w:t xml:space="preserve">Lectura y reconstrucción</w:t>
+              <w:t xml:space="preserve">Lectura + round-trip</w:t>
             </w:r>
           </w:p>
         </w:tc>
@@ -1222,7 +1446,7 @@
                 <w:sz w:val="20"/>
                 <w:szCs w:val="20"/>
               </w:rPr>
-              <w:t xml:space="preserve">Correcta</w:t>
+              <w:t xml:space="preserve">Reconstruye bien</w:t>
             </w:r>
           </w:p>
         </w:tc>
@@ -1282,7 +1506,7 @@
                 <w:sz w:val="20"/>
                 <w:szCs w:val="20"/>
               </w:rPr>
-              <w:t xml:space="preserve">30</w:t>
+              <w:t xml:space="preserve">25</w:t>
             </w:r>
           </w:p>
         </w:tc>
@@ -1384,7 +1608,7 @@
                 <w:sz w:val="20"/>
                 <w:szCs w:val="20"/>
               </w:rPr>
-              <w:t xml:space="preserve">25</w:t>
+              <w:t xml:space="preserve">20</w:t>
             </w:r>
           </w:p>
         </w:tc>
@@ -1406,7 +1630,7 @@
                 <w:sz w:val="20"/>
                 <w:szCs w:val="20"/>
               </w:rPr>
-              <w:t xml:space="preserve">README y repositorio</w:t>
+              <w:t xml:space="preserve">Separación (repositorio) + README</w:t>
             </w:r>
           </w:p>
         </w:tc>
@@ -1426,7 +1650,7 @@
                 <w:sz w:val="20"/>
                 <w:szCs w:val="20"/>
               </w:rPr>
-              <w:t xml:space="preserve">Ordenado</w:t>
+              <w:t xml:space="preserve">Clara y justificada</w:t>
             </w:r>
           </w:p>
         </w:tc>
@@ -1486,7 +1710,7 @@
                 <w:sz w:val="20"/>
                 <w:szCs w:val="20"/>
               </w:rPr>
-              <w:t xml:space="preserve">15</w:t>
+              <w:t xml:space="preserve">30</w:t>
             </w:r>
           </w:p>
         </w:tc>
@@ -1505,7 +1729,7 @@
           <w:sz w:val="21"/>
           <w:szCs w:val="21"/>
         </w:rPr>
-        <w:t xml:space="preserve">Nota: actividad formativa y opcional (sin nota en Moodle). La guía unificada de entrega estará en el Manual de Entrega de Actividades Opcionales (próximamente).</w:t>
+        <w:t xml:space="preserve">Nota: actividad formativa y opcional (sin nota en Moodle). La guía unificada para entregar todas las actividades opcionales, válida para todas las materias, estará en el Manual de Entrega de Actividades Opcionales (próximamente).</w:t>
       </w:r>
     </w:p>
     <w:sectPr>

</xml_diff>